<commit_message>
Serve the learner kit from this public repository and replace the workbook
The repository is now public, so learners take the kit from learner-kit/ at
its root instead of a separate kit repository. Prompts, guide templates, the
Session 01 setup prompt and page, the README and CLAUDE.md point there; the
guides and LEARNER_PROMPTS.md are regenerated, check.py passes and every check
pack still passes against its tag.

L3 Update.xlsx, an internal planning workbook, is removed. Building Agentic
Platforms - programme.xlsx keeps only this programme's setup: a Programme sheet
(format, dates, audience, About copy, entry criteria, how learners work,
capstone, Bloom's verbs) and a Sessions sheet with one row per session and
references taken from the guide specs, so each title has its own link.

Co-Authored-By: Claude Opus 5.5 <noreply@anthropic.com>
Claude-Session: https://claude.ai/code/session_0123W63ZaDAAnYHCFqarTnbL
</commit_message>
<xml_diff>
--- a/L3 2026 Agentic Platform Instructor Materials/instructor-guides/01 Agent architecture and the ReAct runtime.docx
+++ b/L3 2026 Agentic Platform Instructor Materials/instructor-guides/01 Agent architecture and the ReAct runtime.docx
@@ -1018,7 +1018,7 @@
     </w:p>
     <w:p>
       <w:r>
-        <w:t xml:space="preserve">Learners need two things: their own project repository in the course GitLab group, and the public </w:t>
+        <w:t xml:space="preserve">Learners need two things: their own project repository in the course GitLab group, and the </w:t>
       </w:r>
       <w:hyperlink r:id="rId10">
         <w:r>
@@ -1026,11 +1026,11 @@
             <w:color w:val="1155CC"/>
             <w:u w:val="single"/>
           </w:rPr>
-          <w:t>course kit</w:t>
+          <w:t>learner kit</w:t>
         </w:r>
       </w:hyperlink>
       <w:r>
-        <w:t>, which holds the starter project and, for each lesson, the given files and the check pack. The kit contains no solutions; the reference checkpoints stay with the instructor as the answer key.</w:t>
+        <w:t xml:space="preserve"> in the public course repository, which holds the starter project and, for each lesson, the given files and the check pack. Learners build their own implementation; the reference checkpoints in the same repository are the instructor's answer key.</w:t>
       </w:r>
     </w:p>
     <w:p>
@@ -1050,7 +1050,7 @@
         <w:t xml:space="preserve">PROMPT </w:t>
       </w:r>
       <w:r>
-        <w:t>Set up my project for the Building Agentic Platforms course, starting at lesson-00. Clone the public course kit from https://github.com/maxvpavlov/agentic-platforms-kit into ~/agentic-course/kit and treat that folder as read-only. Create my own project in ~/agentic-course/my-platform by copying the kit's starter folder, and make it a fresh Git repository with one initial commit. Install the pinned dependencies with uv for Python 3.12, run the tests with python -m pytest, and confirm that incident/__init__.py says LESSON = 0. Install the GitLab CLI, glab, if it is missing, and sign me in to GitLab; when a browser sign-in is needed, tell me what to do, and never ask me to paste a token into the chat. Ask me for the name of the GitLab group I was invited to, create a private repository for my project in that group, and push my project to it. Report both folder paths, the files in my project, the test result, the GitLab repository address and anything missing, such as uv, Python 3.12, glab or access to the group. Do not ask me to run terminal commands.</w:t>
+        <w:t>Set up my project for the Building Agentic Platforms course, starting at lesson-00. Clone the public course repository from https://github.com/maxvpavlov/ciklum-innovate-l3-2026 into ~/agentic-course/course and treat that folder as read-only; its learner-kit folder is the course kit. Create my own project in ~/agentic-course/my-platform by copying learner-kit/starter, and make it a fresh Git repository with one initial commit. Install the pinned dependencies with uv for Python 3.12, run the tests with python -m pytest, and confirm that incident/__init__.py says LESSON = 0. Install the GitLab CLI, glab, if it is missing, and sign me in to GitLab; when a browser sign-in is needed, tell me what to do, and never ask me to paste a token into the chat. Ask me for the name of the GitLab group I was invited to, create a private repository for my project in that group, and push my project to it. Report both folder paths, the files in my project, the test result, the GitLab repository address and anything missing, such as uv, Python 3.12, glab or access to the group. Do not ask me to run terminal commands.</w:t>
       </w:r>
     </w:p>
     <w:p>
@@ -1070,7 +1070,7 @@
         <w:t xml:space="preserve">PROMPT </w:t>
       </w:r>
       <w:r>
-        <w:t>Read lessons/01 in the course kit: its README, the given files and the check pack. Copy the given files and the check pack into my project exactly as the README says, without changing them, and commit that. Then list the interfaces my code must provide, which checks now fail and why, and the capability they verify. Explain the implementation sequence before we begin. Do not write the implementation yet, and do not look for or use a finished solution.</w:t>
+        <w:t>Read learner-kit/lessons/01 in the course repository: its README, the given files and the check pack. Copy the given files and the check pack into my project exactly as the README says, without changing them, and commit that. Then list the interfaces my code must provide, which checks now fail and why, and the capability they verify. Explain the implementation sequence before we begin. Do not write the implementation yet, and do not look for or use a finished solution.</w:t>
       </w:r>
     </w:p>
     <w:p>

</xml_diff>

<commit_message>
Close the wording gaps found by the second Session 01 dry run
A second isolated dry run passed with no facts left to infer from the tests.
Its remaining notes are now in the prompts: step 3 adds the step guard and
step 4 the other three; the token check counts usage already reported; a
repeated call is refused before it runs; one provider error type that never
leaks the key; the Anthropic and OpenAI request shapes; when MODEL_BASE_URL is
needed; the exercise passes Limits values from the project root; and verify
runs with the mock provider. Guides and LEARNER_PROMPTS.md regenerated,
check.py passes, the Session 01 page synced.

Co-Authored-By: Claude Opus 5.5 <noreply@anthropic.com>
Claude-Session: https://claude.ai/code/session_0123W63ZaDAAnYHCFqarTnbL
</commit_message>
<xml_diff>
--- a/L3 2026 Agentic Platform Instructor Materials/instructor-guides/01 Agent architecture and the ReAct runtime.docx
+++ b/L3 2026 Agentic Platform Instructor Materials/instructor-guides/01 Agent architecture and the ReAct runtime.docx
@@ -1883,7 +1883,7 @@
         <w:t xml:space="preserve">PROMPT </w:t>
       </w:r>
       <w:r>
-        <w:t>For Lesson 01, continue in my learner project. Implement the provider interface in incident/providers.py using the current core contracts. Paste the given MockProvider from the course kit unchanged, and implement configurable OpenAI-compatible and Anthropic adapters as HTTPProvider(kind, model, api_key, base_url=None, transport=None) with kind openai, openai-compatible or anthropic; complete(messages, tools, max_tokens=500) must work without max_tokens, and Reply.tokens is input plus output tokens. Provider selection comes from MODEL_PROVIDER (default mock), MODEL_NAME, MODEL_API_KEY and MODEL_BASE_URL. Normalize messages, tool calls, errors and usage into Reply. Use mock HTTP responses (httpx.MockTransport) to check both adapter request shapes without paid calls; the check pack's adapter tests can only run after step 3, so rerun them then. Explain how provider selection and secrets are configured without exposing credentials. Build to the interfaces the Lesson 01 check pack uses, and do not edit the check pack or the given files. Preserve earlier behaviour, run relevant checks and show the change and observed evidence. Stop at this step.</w:t>
+        <w:t>For Lesson 01, continue in my learner project. Implement the provider interface in incident/providers.py using the current core contracts. Paste the given MockProvider from the course kit unchanged, and implement configurable OpenAI-compatible and Anthropic adapters as HTTPProvider(kind, model, api_key, base_url=None, transport=None) with kind openai, openai-compatible or anthropic; complete(messages, tools, max_tokens=500) must work without max_tokens, and Reply.tokens is input plus output tokens. Provider selection comes from MODEL_PROVIDER (default mock), MODEL_NAME, MODEL_API_KEY and MODEL_BASE_URL, which overrides the default endpoint and is needed for OpenAI-compatible providers other than OpenAI. Normalize messages, tool calls and usage into Reply, and raise one provider error type whose message never includes the key or a response body. For Anthropic, the system message goes in a top-level system field and each tool's parameters become input_schema; OpenAI-compatible requests send the key as a Bearer Authorization header. Use mock HTTP responses (httpx.MockTransport) to check both adapter request shapes without paid calls; the check pack's adapter tests can only run after step 3, so rerun them then. Explain how provider selection and secrets are configured without exposing credentials. Build to the interfaces the Lesson 01 check pack uses, and do not edit the check pack or the given files. Preserve earlier behaviour, run relevant checks and show the change and observed evidence. Stop at this step.</w:t>
       </w:r>
     </w:p>
     <w:p>
@@ -2017,7 +2017,7 @@
         <w:t xml:space="preserve">PROMPT </w:t>
       </w:r>
       <w:r>
-        <w:t>For Lesson 01, continue in my learner project. Implement run_agent in incident/core.py and connect the synthetic readers in the given incident/fixtures.py. Use the signature run_agent(provider, execute, schemas, task, context=None, limits=None, checkpoint=None): start the conversation with a system message and the task as a user message, preserve assistant tool-call IDs when appending observations as tool messages, and track pending calls before dispatch. Finish with a JSON answer that has status (complete or insufficient_evidence), cause, summary and evidence, where evidence lists source_id values actually seen in tool results. Count each model call as a step; the INC-001 path takes 3. Use the existing provider interface. Show the complete model-to-tool-to-observation path for INC-001 and explain how the same loop can later support checkpointing. After this step the happy path, step-limit and adapter tests should pass; the token and time limits come in step 4. Build to the interfaces the Lesson 01 check pack uses, and do not edit the check pack or the given files. Preserve earlier behaviour, run relevant checks and show the change and observed evidence. Stop at this step.</w:t>
+        <w:t>For Lesson 01, continue in my learner project. Implement run_agent in incident/core.py and connect the synthetic readers in the given incident/fixtures.py. Use the signature run_agent(provider, execute, schemas, task, context=None, limits=None, checkpoint=None): start the conversation with a system message and the task as a user message, preserve assistant tool-call IDs when appending observations as tool messages, and track pending calls before dispatch. Finish with a JSON answer that has status (complete or insufficient_evidence), cause, summary and evidence, where evidence lists source_id values actually seen in tool results. Count each model call as a step; the INC-001 path takes 3. Use the existing provider interface. Show the complete model-to-tool-to-observation path for INC-001 and explain how the same loop can later support checkpointing. Add the step guard now: when the step limit is reached without an answer, fail the run with step_budget. After this step the happy path, step-limit and adapter tests should pass; the token, time and repeated-action guards come in step 4. Build to the interfaces the Lesson 01 check pack uses, and do not edit the check pack or the given files. Preserve earlier behaviour, run relevant checks and show the change and observed evidence. Stop at this step.</w:t>
       </w:r>
     </w:p>
     <w:p>
@@ -2169,7 +2169,7 @@
         <w:t xml:space="preserve">PROMPT </w:t>
       </w:r>
       <w:r>
-        <w:t>For Lesson 01, continue in my learner project. Review and enforce the runtime's step, token, elapsed-time and repeated-action guards, failing the run with exactly these error codes: step_budget, token_budget, TimeoutError (the deadline must cancel a provider call in progress) and repeated_action (the same tool with the same arguments requested twice in one run). Estimate input tokens before each model call as roughly the length of the serialized messages divided by three, add max_output_tokens, and refuse the call if that would exceed the budget. Make the Session 01 check pack pass. Demonstrate the normal cited answer and deliberately trigger each limit using offline fixtures. Explain the approximate pre-dispatch token estimate and distinguish reported usage from configured cost. Show which guard caused each failure and why the run stopped. Build to the interfaces the Lesson 01 check pack uses, and do not edit the check pack or the given files. Preserve earlier behaviour, run relevant checks and show the change and observed evidence. Stop at this step.</w:t>
+        <w:t>For Lesson 01, continue in my learner project. Keep the step guard and add the token, elapsed-time and repeated-action guards, so that runs fail with exactly these error codes: step_budget, token_budget, TimeoutError (the deadline must cancel a provider call in progress) and repeated_action (the same tool with the same arguments requested twice in one run, refused before it runs again). Estimate input tokens before each model call as roughly the length of the serialized messages divided by three, and refuse the call if the tokens already reported in this run plus that estimate plus max_output_tokens would exceed the budget. Make the Session 01 check pack pass. Demonstrate the normal cited answer and deliberately trigger each limit using offline fixtures. Explain the approximate pre-dispatch token estimate and distinguish reported usage from configured cost. Show which guard caused each failure and why the run stopped. Build to the interfaces the Lesson 01 check pack uses, and do not edit the check pack or the given files. Preserve earlier behaviour, run relevant checks and show the change and observed evidence. Stop at this step.</w:t>
       </w:r>
     </w:p>
     <w:p>
@@ -2296,7 +2296,7 @@
         <w:t xml:space="preserve">PROMPT </w:t>
       </w:r>
       <w:r>
-        <w:t>Help me carry out the Lesson 01 learner exercise in my existing project: In a throwaway script, change Limits to allow one step, then a tiny token budget, then a short deadline with a slow MockProvider (MockProvider(latency=...)). Predict and observe step_budget, token_budget and TimeoutError. Restore the normal limits and verify the cited happy-path answer. First state the expected outcomes, then run the experiment in a throwaway script outside tests/, or from a clean Git state you can restore. Show the observed results and explain any discrepancy. Keep the original acceptance criteria and restore temporary experiments when finished.</w:t>
+        <w:t>Help me carry out the Lesson 01 learner exercise in my existing project: In a throwaway script run from the project root, pass different Limits values to run_agent, without editing the defaults: allow one step, then a tiny token budget, then a short deadline with a slow MockProvider (MockProvider(latency=...)). Predict and observe step_budget, token_budget and TimeoutError. Restore the normal limits and verify the cited happy-path answer. First state the expected outcomes, then run the experiment in a throwaway script outside tests/, or from a clean Git state you can restore. Show the observed results and explain any discrepancy. Keep the original acceptance criteria and restore temporary experiments when finished.</w:t>
       </w:r>
     </w:p>
     <w:p>
@@ -2322,7 +2322,7 @@
         <w:t xml:space="preserve">PROMPT </w:t>
       </w:r>
       <w:r>
-        <w:t>Verify my Lesson 01 implementation against its completion criteria. Update the checkpoint indicator in incident/__init__.py to 1 only when the required capability is present. Run the full test suite, which includes the Lesson 01 check pack and every earlier lesson's tests, and then the Session 01 demonstration with python -m incident.lab 1, all unchanged and using the offline provider. Confirm that the passing count matches the one in the Lesson 01 check pack README. Keep the expected outcomes unchanged. Report checks actually executed, failures, relevant output and any untested integration. Explain the result, then commit my work and push it to my GitLab repository. Do not equate an unrun or skipped check with a pass.</w:t>
+        <w:t>Verify my Lesson 01 implementation against its completion criteria. Update the checkpoint indicator in incident/__init__.py to 1 only when the required capability is present. Run the full test suite, which includes the Lesson 01 check pack and every earlier lesson's tests, and then the Session 01 demonstration with python -m incident.lab 1, all unchanged and using the offline provider (MODEL_PROVIDER unset or set to mock). Confirm that the passing count matches the one in the Lesson 01 check pack README. Keep the expected outcomes unchanged. Report checks actually executed, failures, relevant output and any untested integration. Explain the result, then commit my work and push it to my GitLab repository. Do not equate an unrun or skipped check with a pass.</w:t>
       </w:r>
     </w:p>
     <w:p>

</xml_diff>

<commit_message>
Point GitLab prompts at gitlab.ciklum.net
The setup prompt signs glab in to gitlab.ciklum.net alongside any existing
GitLab sign-ins and names that host in every glab command; the prepare and
verify prompts, kit READMEs, Session 01 page and deck name the host too.
Guides and LEARNER_PROMPTS.md regenerated; check.py passes.

Co-Authored-By: Claude Opus 5.5 <noreply@anthropic.com>
Claude-Session: https://claude.ai/code/session_0123W63ZaDAAnYHCFqarTnbL
</commit_message>
<xml_diff>
--- a/L3 2026 Agentic Platform Instructor Materials/instructor-guides/01 Agent architecture and the ReAct runtime.docx
+++ b/L3 2026 Agentic Platform Instructor Materials/instructor-guides/01 Agent architecture and the ReAct runtime.docx
@@ -1008,7 +1008,7 @@
     </w:p>
     <w:p>
       <w:r>
-        <w:t>Refresh 2025 LLM/prompting/RAG basics and HTTP, JSON, async programming and tests. Prepare a demonstration project from the course kit's starter exactly as a learner would, with a GitLab repository in the course group, and rehearse all thirteen prompts on it. Keep the reference checkpoints at hand as the answer key for the excerpts. Read the architecture, ReAct and chosen model API tool-calling references.</w:t>
+        <w:t>Refresh 2025 LLM/prompting/RAG basics and HTTP, JSON, async programming and tests. Prepare a demonstration project from the course kit's starter exactly as a learner would, with a repository in the course group on gitlab.ciklum.net, and rehearse all thirteen prompts on it. Keep the reference checkpoints at hand as the answer key for the excerpts. Read the architecture, ReAct and chosen model API tool-calling references.</w:t>
       </w:r>
     </w:p>
     <w:p>
@@ -1018,7 +1018,7 @@
     </w:p>
     <w:p>
       <w:r>
-        <w:t xml:space="preserve">Learners need two things: their own project repository in the course GitLab group, and the </w:t>
+        <w:t xml:space="preserve">Learners need two things: their own project repository in the course GitLab group on gitlab.ciklum.net, and the </w:t>
       </w:r>
       <w:hyperlink r:id="rId10">
         <w:r>
@@ -1050,7 +1050,7 @@
         <w:t xml:space="preserve">PROMPT </w:t>
       </w:r>
       <w:r>
-        <w:t>Set up my project for the Building Agentic Platforms course, starting at lesson-00. Clone the public course repository from https://github.com/maxvpavlov/ciklum-innovate-l3-2026 into ~/agentic-course/course and treat that folder as read-only; its learner-kit folder is the course kit. Create my own project in ~/agentic-course/my-platform by copying learner-kit/starter, and make it a fresh Git repository on branch main with one initial commit; if Git has no user name or email, set them for this repository only and tell me. Install the pinned dependencies with uv for Python 3.12, run the tests with python -m pytest, and confirm that incident/__init__.py says LESSON = 0. Install the GitLab CLI, glab, if it is missing, and sign me in to GitLab; when a browser sign-in is needed, tell me what to do, and never ask me to paste a token into the chat. Ask me for the name of the GitLab group I was invited to, create a private repository for my project in that group, and push my project to it. Report both folder paths, the files in my project, the test result, the GitLab repository address and anything missing, such as uv, Python 3.12, glab or access to the group. Do not ask me to run terminal commands.</w:t>
+        <w:t>Set up my project for the Building Agentic Platforms course, starting at lesson-00. Clone the public course repository from https://github.com/maxvpavlov/ciklum-innovate-l3-2026 into ~/agentic-course/course and treat that folder as read-only; its learner-kit folder is the course kit. Create my own project in ~/agentic-course/my-platform by copying learner-kit/starter, and make it a fresh Git repository on branch main with one initial commit; if Git has no user name or email, set them for this repository only and tell me. Install the pinned dependencies with uv for Python 3.12, run the tests with python -m pytest, and confirm that incident/__init__.py says LESSON = 0. Install the GitLab CLI, glab, if it is missing, and sign me in to the course GitLab at gitlab.ciklum.net. glab may already be signed in to other GitLab hosts, such as gitlab.com: keep those sign-ins, add gitlab.ciklum.net alongside them, and name gitlab.ciklum.net as the host in every glab command, because glab otherwise uses a default host. When a browser sign-in is needed, tell me what to do, and never ask me to paste a token into the chat. Ask me for the name of the group I was invited to on gitlab.ciklum.net, create a private repository for my project in that group, set it as the origin remote and push my project to it. Report both folder paths, the files in my project, the test result, the GitLab repository address and anything missing, such as uv, Python 3.12, glab or access to the group on gitlab.ciklum.net. Do not ask me to run terminal commands.</w:t>
       </w:r>
     </w:p>
     <w:p>
@@ -1086,7 +1086,7 @@
     </w:p>
     <w:p>
       <w:r>
-        <w:t>Session 01 is a demonstration. Learners need nothing before class and do not build during it: after class they repeat every prompt in their own project, starting with the setup prompt that creates their repository in the course GitLab group. Show each prompt exactly as they will use it, and point out where the check pack, the given files and the push happen.</w:t>
+        <w:t>Session 01 is a demonstration. Learners need nothing before class and do not build during it: after class they repeat every prompt in their own project, starting with the setup prompt that creates their repository in the course GitLab group on gitlab.ciklum.net. Show each prompt exactly as they will use it, and point out where the check pack, the given files and the push happen.</w:t>
       </w:r>
     </w:p>
     <w:p>
@@ -2322,7 +2322,7 @@
         <w:t xml:space="preserve">PROMPT </w:t>
       </w:r>
       <w:r>
-        <w:t>Verify my Lesson 01 implementation against its completion criteria. Update the checkpoint indicator in incident/__init__.py to 1 only when the required capability is present. Run the full test suite, which includes the Lesson 01 check pack and every earlier lesson's tests, and then the Session 01 demonstration with python -m incident.lab 1, all unchanged and using the offline provider (MODEL_PROVIDER unset or set to mock). Confirm that the passing count matches the one in the Lesson 01 check pack README. Keep the expected outcomes unchanged. Report checks actually executed, failures, relevant output and any untested integration. Explain the result, then commit my work and push it to my GitLab repository. Do not equate an unrun or skipped check with a pass.</w:t>
+        <w:t>Verify my Lesson 01 implementation against its completion criteria. Update the checkpoint indicator in incident/__init__.py to 1 only when the required capability is present. Run the full test suite, which includes the Lesson 01 check pack and every earlier lesson's tests, and then the Session 01 demonstration with python -m incident.lab 1, all unchanged and using the offline provider (MODEL_PROVIDER unset or set to mock). Confirm that the passing count matches the one in the Lesson 01 check pack README. Keep the expected outcomes unchanged. Report checks actually executed, failures, relevant output and any untested integration. Explain the result, then commit my work and push it to my repository on gitlab.ciklum.net; if glab is also signed in to other GitLab hosts, make sure the push goes to gitlab.ciklum.net. Do not equate an unrun or skipped check with a pass.</w:t>
       </w:r>
     </w:p>
     <w:p>

</xml_diff>

<commit_message>
Session 01: name the owners platform, runtime and model
The ownership table said "application", while the course frames the parts
as platform, runtime and model. The platform sets identity, permissions and
limits (until Session 08 the code that starts the run plays it), the runtime
enforces them and records events, and the model only proposes. Page, deck
and guide 01 updated.

Co-Authored-By: Claude Opus 5.5 <noreply@anthropic.com>
Claude-Session: https://claude.ai/code/session_0123W63ZaDAAnYHCFqarTnbL
</commit_message>
<xml_diff>
--- a/L3 2026 Agentic Platform Instructor Materials/instructor-guides/01 Agent architecture and the ReAct runtime.docx
+++ b/L3 2026 Agentic Platform Instructor Materials/instructor-guides/01 Agent architecture and the ReAct runtime.docx
@@ -1731,7 +1731,7 @@
         <w:t xml:space="preserve">SAY </w:t>
       </w:r>
       <w:r>
-        <w:t>Start with the values that application code controls. Tenant, run identifier, role and permitted tools belong in the execution context. They must not be supplied by a retrieved document. Keep the evolving messages and result in Run. This separation will matter when we persist a run or create a child: we can serialize task state while deliberately constructing its authority. Walk through one example context for Astro, then point to Limits. We have separate limits on steps, reported tokens, elapsed time and maximum requested output. These limits address different failure modes. Ask participants to identify the limit that catches a provider that hangs without producing any tokens.</w:t>
+        <w:t>Start with the values the platform controls; in this session, the code that starts the run plays the platform. Tenant, run identifier, role and permitted tools belong in the execution context. They must not be supplied by a retrieved document. Keep the evolving messages and result in Run. This separation will matter when we persist a run or create a child: we can serialize task state while deliberately constructing its authority. Walk through one example context for Astro, then point to Limits. We have separate limits on steps, reported tokens, elapsed time and maximum requested output. These limits address different failure modes. Ask participants to identify the limit that catches a provider that hangs without producing any tokens.</w:t>
       </w:r>
     </w:p>
     <w:p>
@@ -1827,7 +1827,7 @@
         <w:t xml:space="preserve">Likely answer </w:t>
       </w:r>
       <w:r>
-        <w:t>An answer is untrusted output. The application constructs Context and decides the permitted capabilities independently.</w:t>
+        <w:t>An answer is untrusted output. The platform constructs Context and decides the permitted capabilities independently.</w:t>
       </w:r>
     </w:p>
     <w:p>

</xml_diff>